<commit_message>
Add parent-controlled home talk sharing, staff access requests, and bug reporting via Settings page.
Co-authored-by: Cursor <cursoragent@cursor.com>
</commit_message>
<xml_diff>
--- a/docs/stakeholder-deliverables/docx/Bainum-FAQ.docx
+++ b/docs/stakeholder-deliverables/docx/Bainum-FAQ.docx
@@ -12,7 +12,7 @@
     </w:p>
     <w:p>
       <w:r>
-        <w:t>**Version:** 1.1 | **Date:** June 2026</w:t>
+        <w:t>Version: 1.1 | Date: June 2026</w:t>
       </w:r>
     </w:p>
     <w:p>
@@ -38,7 +38,7 @@
     </w:p>
     <w:p>
       <w:r>
-        <w:t>**Audience: All**</w:t>
+        <w:t>Audience: All</w:t>
       </w:r>
     </w:p>
     <w:p>
@@ -56,7 +56,7 @@
     </w:p>
     <w:p>
       <w:r>
-        <w:t>**Audience: All**</w:t>
+        <w:t>Audience: All</w:t>
       </w:r>
     </w:p>
     <w:p>
@@ -64,7 +64,7 @@
         <w:pStyle w:val="ListBullet"/>
       </w:pPr>
       <w:r>
-        <w:t>**Admin** — manages schools, teachers, children, and all classrooms.</w:t>
+        <w:t>Admin — manages schools, teachers, children, and all classrooms.</w:t>
       </w:r>
     </w:p>
     <w:p>
@@ -72,7 +72,7 @@
         <w:pStyle w:val="ListBullet"/>
       </w:pPr>
       <w:r>
-        <w:t>**Teacher** — manages assigned classrooms, recordings, and adding parents.</w:t>
+        <w:t>Teacher — manages assigned classrooms, recordings, and adding parents.</w:t>
       </w:r>
     </w:p>
     <w:p>
@@ -80,7 +80,7 @@
         <w:pStyle w:val="ListBullet"/>
       </w:pPr>
       <w:r>
-        <w:t>**Parent** — sees only their own child's data and read-only classroom views.</w:t>
+        <w:t>Parent — sees only their own child's data and read-only classroom views.</w:t>
       </w:r>
     </w:p>
     <w:p>
@@ -93,12 +93,12 @@
     </w:p>
     <w:p>
       <w:r>
-        <w:t>**Audience: All**</w:t>
+        <w:t>Audience: All</w:t>
       </w:r>
     </w:p>
     <w:p>
       <w:r>
-        <w:t>Use **Forgot password** on the login page, submit your email, and follow the link in the message. If email does not arrive, check spam or contact your administrator.</w:t>
+        <w:t>Use Forgot password on the login page, submit your email, and follow the link in the message. If email does not arrive, check spam or contact your administrator.</w:t>
       </w:r>
     </w:p>
     <w:p>
@@ -124,7 +124,7 @@
     </w:p>
     <w:p>
       <w:r>
-        <w:t>**Audience: Parent**</w:t>
+        <w:t>Audience: Parent</w:t>
       </w:r>
     </w:p>
     <w:p>
@@ -142,12 +142,12 @@
     </w:p>
     <w:p>
       <w:r>
-        <w:t>**Audience: Admin, Teacher**</w:t>
+        <w:t>Audience: Admin, Teacher</w:t>
       </w:r>
     </w:p>
     <w:p>
       <w:r>
-        <w:t>An administrator adds a teacher directly or sends a **teacher invitation** email with registration instructions.</w:t>
+        <w:t>An administrator adds a teacher directly or sends a teacher invitation email with registration instructions.</w:t>
       </w:r>
     </w:p>
     <w:p>
@@ -160,12 +160,12 @@
     </w:p>
     <w:p>
       <w:r>
-        <w:t>**Audience: Admin, Teacher**</w:t>
+        <w:t>Audience: Admin, Teacher</w:t>
       </w:r>
     </w:p>
     <w:p>
       <w:r>
-        <w:t>**Add Parents** enrolls invited parents (and selected children) into a classroom. It replaces the older "Invite Parents" label; the action adds membership and may trigger an in-app notification. Enrollment is mirrored on each child's profile (**Classrooms** section shows the room name).</w:t>
+        <w:t>Add Parents enrolls invited parents (and selected children) into a classroom. It replaces the older "Invite Parents" label; the action adds membership and may trigger an in-app notification. Enrollment is mirrored on each child's profile (Classrooms section shows the room name).</w:t>
       </w:r>
     </w:p>
     <w:p>
@@ -191,12 +191,12 @@
     </w:p>
     <w:p>
       <w:r>
-        <w:t>**Audience: Admin, Teacher**</w:t>
+        <w:t>Audience: Admin, Teacher</w:t>
       </w:r>
     </w:p>
     <w:p>
       <w:r>
-        <w:t>The classroom roster should list every enrolled child for both roles. If counts differ, refresh the classroom page after a recent enrollment — the system repairs roster drift automatically. If a child still appears missing, confirm they were added through **Add Parents** (same school rule) or ask an admin to re-add the parent/child pair.</w:t>
+        <w:t>The classroom roster should list every enrolled child for both roles. If counts differ, refresh the classroom page after a recent enrollment — the system repairs roster drift automatically. If a child still appears missing, confirm they were added through Add Parents (same school rule) or ask an admin to re-add the parent/child pair.</w:t>
       </w:r>
     </w:p>
     <w:p>
@@ -209,7 +209,7 @@
     </w:p>
     <w:p>
       <w:r>
-        <w:t>**Audience: Admin, Teacher**</w:t>
+        <w:t>Audience: Admin, Teacher</w:t>
       </w:r>
     </w:p>
     <w:p>
@@ -227,12 +227,12 @@
     </w:p>
     <w:p>
       <w:r>
-        <w:t>**Audience: Admin, Teacher (lead only)**</w:t>
+        <w:t>Audience: Admin, Teacher (lead only)</w:t>
       </w:r>
     </w:p>
     <w:p>
       <w:r>
-        <w:t>Open the classroom homepage, scroll to the bottom, expand **Advanced options**, and click the small **Delete classroom** link. Confirm in the modal. Assistant teachers cannot delete classrooms. Deletion is permanent for the classroom record; child data and historical recordings on child profiles are retained.</w:t>
+        <w:t>Open the classroom homepage, scroll to the bottom, expand Advanced options, and click the small Delete classroom link. Confirm in the modal. Assistant teachers cannot delete classrooms. Deletion is permanent for the classroom record; child data and historical recordings on child profiles are retained.</w:t>
       </w:r>
     </w:p>
     <w:p>
@@ -245,12 +245,12 @@
     </w:p>
     <w:p>
       <w:r>
-        <w:t>**Audience: Parent**</w:t>
+        <w:t>Audience: Parent</w:t>
       </w:r>
     </w:p>
     <w:p>
       <w:r>
-        <w:t>On the **Dashboard** under **My Children's Classrooms** (there is no separate **Classrooms** sidebar item for parents). Open a card for the read-only classroom view, or use **My Child's Data** in the sidebar for charts and transcripts.</w:t>
+        <w:t>On the Dashboard under My Children's Classrooms (there is no separate Classrooms sidebar item for parents). Open a card for the read-only classroom view, or use My Child's Data in the sidebar for charts and transcripts.</w:t>
       </w:r>
     </w:p>
     <w:p>
@@ -276,12 +276,30 @@
     </w:p>
     <w:p>
       <w:r>
-        <w:t>**Audience: Parent**</w:t>
+        <w:t>Audience: Parent</w:t>
       </w:r>
     </w:p>
     <w:p>
       <w:r>
-        <w:t>Only you, your child's assigned teachers (with active access), and program administrators can see your child's full assessment data. Other parents in the same classroom see only roster names, not other children's full records.</w:t>
+        <w:t>Only you, your child's assigned teachers (with active access), and program administrators can see your child's classroom assessment data. Home talk data — recordings you make from the Home tab — is private to your family: teachers and administrators can never see it. Other parents in the same classroom see only roster names, not other children's full records.</w:t>
+      </w:r>
+    </w:p>
+    <w:p>
+      <w:pPr>
+        <w:pStyle w:val="Heading3"/>
+      </w:pPr>
+      <w:r>
+        <w:t>What are the Home talk and Classroom talk views?</w:t>
+      </w:r>
+    </w:p>
+    <w:p>
+      <w:r>
+        <w:t>Audience: Parent</w:t>
+      </w:r>
+    </w:p>
+    <w:p>
+      <w:r>
+        <w:t>Your child's data page has two tabs: Classroom talk (recordings made at the program) and Home talk (recordings you make from the Home tab). Charts, words-per-minute stats, transcripts, and the combined download all follow the selected tab, so home and classroom talk are never mixed together.</w:t>
       </w:r>
     </w:p>
     <w:p>
@@ -294,7 +312,7 @@
     </w:p>
     <w:p>
       <w:r>
-        <w:t>**Audience: All**</w:t>
+        <w:t>Audience: All</w:t>
       </w:r>
     </w:p>
     <w:p>
@@ -312,12 +330,12 @@
     </w:p>
     <w:p>
       <w:r>
-        <w:t>**Audience: All**</w:t>
+        <w:t>Audience: All</w:t>
       </w:r>
     </w:p>
     <w:p>
       <w:r>
-        <w:t>A **School** is the physical or organizational site (e.g., a preschool building). A **Classroom** is a teaching group within the program, led by a teacher, with children and parents enrolled. Teachers and children are affiliated with a school; classrooms group participants for instruction and recordings.</w:t>
+        <w:t>A School is the physical or organizational site (e.g., a preschool building). A Classroom is a teaching group within the program, led by a teacher, with children and parents enrolled. Teachers and children are affiliated with a school; classrooms group participants for instruction and recordings.</w:t>
       </w:r>
     </w:p>
     <w:p>
@@ -343,12 +361,12 @@
     </w:p>
     <w:p>
       <w:r>
-        <w:t>**Audience: Teacher, Parent**</w:t>
+        <w:t>Audience: Teacher, Parent</w:t>
       </w:r>
     </w:p>
     <w:p>
       <w:r>
-        <w:t>Use the **Home** tab in the sidebar (parents) or **Record** on a classroom homepage (teachers). Choose **which child** (parents with multiple children), then pick **location** and **activity** from the lists, or **Other** and type a custom label. Submit audio when prompted.</w:t>
+        <w:t>Use the Home tab in the sidebar (parents) or Record on a classroom homepage (teachers). Choose which child (parents with multiple children), then pick location and activity from the lists, or Other and type a custom label. Submit audio when prompted.</w:t>
       </w:r>
     </w:p>
     <w:p>
@@ -361,7 +379,7 @@
     </w:p>
     <w:p>
       <w:r>
-        <w:t>**Audience: Teacher, Parent**</w:t>
+        <w:t>Audience: Teacher, Parent</w:t>
       </w:r>
     </w:p>
     <w:p>
@@ -374,12 +392,30 @@
         <w:pStyle w:val="Heading3"/>
       </w:pPr>
       <w:r>
+        <w:t>How long can I record?</w:t>
+      </w:r>
+    </w:p>
+    <w:p>
+      <w:r>
+        <w:t>Audience: Teacher, Parent</w:t>
+      </w:r>
+    </w:p>
+    <w:p>
+      <w:r>
+        <w:t>In-browser recordings can run up to 60 minutes. Every 15 minutes, a pop-up reminds you the recording is still on and asks whether to keep recording or stop — recording continues uninterrupted until you choose or the 60-minute limit is reached. Note that very long recordings may exceed the 25 MB upload limit; for long sessions, consider stopping and uploading in parts.</w:t>
+      </w:r>
+    </w:p>
+    <w:p>
+      <w:pPr>
+        <w:pStyle w:val="Heading3"/>
+      </w:pPr>
+      <w:r>
         <w:t>What happens after I upload audio?</w:t>
       </w:r>
     </w:p>
     <w:p>
       <w:r>
-        <w:t>**Audience: Teacher, Parent**</w:t>
+        <w:t>Audience: Teacher, Parent</w:t>
       </w:r>
     </w:p>
     <w:p>
@@ -410,12 +446,12 @@
     </w:p>
     <w:p>
       <w:r>
-        <w:t>**Audience: All**</w:t>
+        <w:t>Audience: All</w:t>
       </w:r>
     </w:p>
     <w:p>
       <w:r>
-        <w:t>Transcripts on child data pages, classroom transcript sections, and combined download files are sorted **newest first** — the most recently saved recording appears at the top, even if its recording date is earlier than an older upload.</w:t>
+        <w:t>Transcripts on child data pages, classroom transcript sections, and combined download files are sorted newest first — the most recently saved recording appears at the top, even if its recording date is earlier than an older upload.</w:t>
       </w:r>
     </w:p>
     <w:p>
@@ -428,12 +464,12 @@
     </w:p>
     <w:p>
       <w:r>
-        <w:t>**Audience: Teacher, Parent**</w:t>
+        <w:t>Audience: Teacher, Parent</w:t>
       </w:r>
     </w:p>
     <w:p>
       <w:r>
-        <w:t>Yes. When a parent records from the **Home** tab, accepted transcripts appear on that child's data page. Classroom lead and assistant teachers (and admins) can review them there alongside classroom recordings. Full chart access may still require an active access grant; transcripts remain visible for supervised children.</w:t>
+        <w:t>No. Home recordings are private to the family. When a parent records from the Home tab, accepted transcripts appear only in the parent's Home talk view on the child's data page. Teachers and administrators see classroom recordings only — home talk data is filtered out on the server, and it does not feed classroom charts or cohort thresholds.</w:t>
       </w:r>
     </w:p>
     <w:p>
@@ -446,12 +482,12 @@
     </w:p>
     <w:p>
       <w:r>
-        <w:t>**Audience: All**</w:t>
+        <w:t>Audience: All</w:t>
       </w:r>
     </w:p>
     <w:p>
       <w:r>
-        <w:t>Transcripts are retained for **one year (365 days)** from the recording date, then removed from active display per platform policy. Charts may still reflect aggregated history depending on configuration.</w:t>
+        <w:t>Transcripts are retained for one year (365 days) from the recording date, then removed from active display per platform policy. Charts may still reflect aggregated history depending on configuration.</w:t>
       </w:r>
     </w:p>
     <w:p>
@@ -464,7 +500,7 @@
     </w:p>
     <w:p>
       <w:r>
-        <w:t>**Audience: All**</w:t>
+        <w:t>Audience: All</w:t>
       </w:r>
     </w:p>
     <w:p>
@@ -482,7 +518,7 @@
     </w:p>
     <w:p>
       <w:r>
-        <w:t>**Audience: Admin, Teacher**</w:t>
+        <w:t>Audience: Admin, Teacher</w:t>
       </w:r>
     </w:p>
     <w:p>
@@ -513,7 +549,7 @@
     </w:p>
     <w:p>
       <w:r>
-        <w:t>**Audience: All**</w:t>
+        <w:t>Audience: All</w:t>
       </w:r>
     </w:p>
     <w:p>
@@ -544,12 +580,12 @@
     </w:p>
     <w:p>
       <w:r>
-        <w:t>**Audience: Admin**</w:t>
+        <w:t>Audience: Admin</w:t>
       </w:r>
     </w:p>
     <w:p>
       <w:r>
-        <w:t>The school filter is built from teacher records. Add schools under **Schools** and ensure teachers have a school assigned on their profile.</w:t>
+        <w:t>The school filter is built from teacher records. Add schools under Schools and ensure teachers have a school assigned on their profile.</w:t>
       </w:r>
     </w:p>
     <w:p>
@@ -562,7 +598,7 @@
     </w:p>
     <w:p>
       <w:r>
-        <w:t>**Audience: All**</w:t>
+        <w:t>Audience: All</w:t>
       </w:r>
     </w:p>
     <w:p>
@@ -575,17 +611,17 @@
         <w:pStyle w:val="Heading3"/>
       </w:pPr>
       <w:r>
-        <w:t>Legacy `/centers` links</w:t>
+        <w:t>Legacy /centers links</w:t>
       </w:r>
     </w:p>
     <w:p>
       <w:r>
-        <w:t>**Audience: Admin**</w:t>
+        <w:t>Audience: Admin</w:t>
       </w:r>
     </w:p>
     <w:p>
       <w:r>
-        <w:t>Old bookmarks to `/centers` redirect automatically to **Schools**.</w:t>
+        <w:t>Old bookmarks to /centers redirect automatically to Schools.</w:t>
       </w:r>
     </w:p>
     <w:p>
@@ -611,7 +647,7 @@
     </w:p>
     <w:p>
       <w:r>
-        <w:t>**Audience: All**</w:t>
+        <w:t>Audience: All</w:t>
       </w:r>
     </w:p>
     <w:p>

</xml_diff>